<commit_message>
EHPM R2: read tempo model-selection stats from tempo_model_selection.json in manuscript generator (remove hard-coded literals; full pipeline traceability)
Co-Authored-By: Tatsuki Onishi <bougtoir@gmail.com>
</commit_message>
<xml_diff>
--- a/healthcare_economic_effect/output/docx/Healthcare_EHPM_ResponseToReviewers.docx
+++ b/healthcare_economic_effect/output/docx/Healthcare_EHPM_ResponseToReviewers.docx
@@ -4,7 +4,7 @@
   <w:body>
     <w:p>
       <w:r>
-        <w:t>July 13, 2026</w:t>
+        <w:t>July 14, 2026</w:t>
       </w:r>
     </w:p>
     <w:p/>
@@ -73,7 +73,7 @@
         <w:t xml:space="preserve">Response: </w:t>
       </w:r>
       <w:r>
-        <w:t>We thank the reviewer for this rigorous and, as it turned out, decisive check. The reviewer is correct on every point, and acting on this comment led us to identify and fix a real problem. (1) We confirmed that the previously public repository was only the minimum proof-of-concept and did not contain the AIC/BIC/LOOCV computations reported in the previous revision; those summary statistics had been entered as fixed constants in the manuscript-preparation code rather than generated by a released, executable pipeline. (2) We therefore rebuilt the tempo analysis as fully executable code that downloads the public World Bank indicators (current health expenditure and life expectancy), constructs the health-capital stock, fits M0, M1, and M2, and computes level RMSE, change RMSE, LOOCV RMSE, AIC, and BIC directly. This code and the input data are now in the public repository (https://github.com/bougtoir/healthcare-economic-effect), and the reported numbers can be regenerated from a clean clone with 'python scripts/tempo_model_selection.py' followed by 'python scripts/analyze_healthcare_economic_effect.py'. The repository now corresponds directly to this manuscript and supersedes the earlier PoC. (3) Recomputing from the public data revealed that the previously reported statistics did not match a correct 2000-2019 (pre-pandemic) run. We traced the discrepancy exactly: the former values were produced from a 2000-2023 sample that inadvertently included the 2020-2022 COVID-19 life-expectancy shock. Running the identical code over 2000-2023 reproduces the former numbers precisely (median level RMSE 0.510/0.441/0.434 for M0/M1/M2, median drift +0.15 yr/yr), whereas the correct 2000-2019 run gives 0.253/0.208/0.207 and a boundary-dominated, poorly identified drift with median -0.10 yr/yr. (4) The central, reproducible finding is unchanged in direction: introducing a spending-to-outcome lag (M1) robustly improves fit over the flow-only model (M0) -- M1 is favoured over M0 by AIC, BIC, and LOOCV in 64%, 64%, and 69% of countries. However, the reproducible analysis does NOT support the former claim of a stable positive tempo drift: the time-varying model M2 is not favoured over M1 by AIC or BIC in any country (0%/0%). We have therefore withdrawn the +0.15 yr/yr drift claim, corrected all affected numbers in the Abstract, Methods, Results (Table 3), Discussion, Conclusions, and figure legends, and now describe M2 as an exploratory specification. (5) Finally, we agree that the manuscript should not depend on unpublished, non-peer-reviewed sources. We have removed both companion working papers (former references 22 and 23, including the inaccessible one) from the reference list and instead cite the established, peer-reviewed origins of the framework directly: Kydland and Prescott's time-to-build theory of capital gestation (Econometrica, 1982) for the investment-to-output lag, and Grossman's health-capital model (J Polit Econ, 1972) together with the Bongaarts-Feeney tempo effect (already cited) for the healthcare application. The tempo model is now fully self-contained: its complete specification is given in the Methods, and its every statistic is reproducible from the public repository, so no unpublished source is required to examine or reproduce the analysis. We are grateful that the reviewer's insistence on reproducibility surfaced this error before publication.</w:t>
+        <w:t>We thank the reviewer for this rigorous and, as it turned out, decisive check. The reviewer is correct on every point, and acting on this comment led us to identify and fix a real problem. (1) We confirmed that the previously public repository was only the minimum proof-of-concept and did not contain the AIC/BIC/LOOCV computations reported in the previous revision; those summary statistics had been entered as fixed constants in the manuscript-preparation code rather than generated by a released, executable pipeline. (2) We therefore rebuilt the tempo analysis as fully executable code that downloads the public World Bank indicators (current health expenditure and life expectancy), constructs the health-capital stock, fits M0, M1, and M2, and computes level RMSE, change RMSE, LOOCV RMSE, AIC, and BIC directly. This code and the input data are now in the public repository (https://github.com/bougtoir/healthcare-economic-effect), and the reported numbers can be regenerated from a clean clone with 'python scripts/tempo_model_selection.py' followed by 'python scripts/analyze_healthcare_economic_effect.py'. The repository now corresponds directly to this manuscript and supersedes the earlier PoC. (3) Recomputing from the public data revealed that the previously reported statistics did not match a correct 2000-2019 (pre-pandemic) run. We traced the discrepancy exactly: the former values were produced from a 2000-2023 sample that inadvertently included the 2020-2022 COVID-19 life-expectancy shock. Running the identical code over 2000-2023 reproduces the former numbers precisely (median level RMSE 0.510/0.441/0.434 for M0/M1/M2, median drift +0.15 yr/yr), whereas the correct 2000-2019 run gives 0.253/0.208/0.207 and a boundary-dominated, poorly identified drift with median −0.10 yr/yr. (4) The central, reproducible finding is unchanged in direction: introducing a spending-to-outcome lag (M1) robustly improves fit over the flow-only model (M0) -- M1 is favoured over M0 by AIC, BIC, and LOOCV in 64%, 64%, and 69% of countries. However, the reproducible analysis does NOT support the former claim of a stable positive tempo drift: the time-varying model M2 is not favoured over M1 by AIC or BIC in any country (0%/0%). We have therefore withdrawn the +0.15 yr/yr drift claim, corrected all affected numbers in the Abstract, Methods, Results (Table 3), Discussion, Conclusions, and figure legends, and now describe M2 as an exploratory specification. (5) Finally, we agree that the manuscript should not depend on unpublished, non-peer-reviewed sources. We have removed both companion working papers (former references 22 and 23, including the inaccessible one) from the reference list and instead cite the established, peer-reviewed origins of the framework directly: Kydland and Prescott's time-to-build theory of capital gestation (Econometrica, 1982) for the investment-to-output lag, and Grossman's health-capital model (J Polit Econ, 1972) together with the Bongaarts-Feeney tempo effect (already cited) for the healthcare application. The tempo model is now fully self-contained: its complete specification is given in the Methods, and its every statistic is reproducible from the public repository, so no unpublished source is required to examine or reproduce the analysis. We are grateful that the reviewer's insistence on reproducibility surfaced this error before publication.</w:t>
       </w:r>
     </w:p>
     <w:p/>

</xml_diff>

<commit_message>
EHPM R2: report M2-vs-M1 BIC win-rate separately from AIC (Discussion + response letter); avoid AIC value standing in for 'both AIC and BIC'
Co-Authored-By: Tatsuki Onishi <bougtoir@gmail.com>
</commit_message>
<xml_diff>
--- a/healthcare_economic_effect/output/docx/Healthcare_EHPM_ResponseToReviewers.docx
+++ b/healthcare_economic_effect/output/docx/Healthcare_EHPM_ResponseToReviewers.docx
@@ -4,7 +4,7 @@
   <w:body>
     <w:p>
       <w:r>
-        <w:t>July 14, 2026</w:t>
+        <w:t>July 15, 2026</w:t>
       </w:r>
     </w:p>
     <w:p/>
@@ -270,7 +270,7 @@
         <w:t xml:space="preserve">Response: </w:t>
       </w:r>
       <w:r>
-        <w:t>We fully agree that symmetric application of model selection criteria is essential. Table 3 now reports LOOCV RMSE, AIC, and BIC for all three models in addition to level and change RMSE, all computed from public World Bank data. The results are revealing: M1 substantially and robustly outperforms M0 on ALL criteria (favoured by AIC/BIC/LOOCV in 64%/64%/69% of countries), confirming the existence of a spending-to-outcome lag. However, M2 does NOT improve on M1 once the extra parameter is penalized (favoured over M1 in 0% of countries by both AIC and BIC). We have therefore withdrawn the previous time-varying drift claim and now report the constant-lag model as the robust supply-side finding.</w:t>
+        <w:t>We fully agree that symmetric application of model selection criteria is essential. Table 3 now reports LOOCV RMSE, AIC, and BIC for all three models in addition to level and change RMSE, all computed from public World Bank data. The results are revealing: M1 substantially and robustly outperforms M0 on ALL criteria (favoured by AIC/BIC/LOOCV in 64%/64%/69% of countries), confirming the existence of a spending-to-outcome lag. However, M2 does NOT improve on M1 once the extra parameter is penalized (favoured over M1 in 0% of countries by AIC and 0% by BIC). We have therefore withdrawn the previous time-varying drift claim and now report the constant-lag model as the robust supply-side finding.</w:t>
       </w:r>
     </w:p>
     <w:p/>

</xml_diff>